<commit_message>
Folders aangepast, en laatste dingen aan teamreflectie en uitgaves
</commit_message>
<xml_diff>
--- a/Teamsreflectie/Teamsreflectie.docx
+++ b/Teamsreflectie/Teamsreflectie.docx
@@ -108,6 +108,18 @@
       </w:pPr>
       <w:r>
         <w:t>Vaker op locatie zijn, en dan ook de fysieke items (schaalmodel) meenemen</w:t>
+      </w:r>
+    </w:p>
+    <w:p>
+      <w:pPr>
+        <w:pStyle w:val="ListParagraph"/>
+        <w:numPr>
+          <w:ilvl w:val="0"/>
+          <w:numId w:val="1"/>
+        </w:numPr>
+      </w:pPr>
+      <w:r>
+        <w:t>Eerder meer vragen stellen over wat de opdrachtgever wilt, wat het einddoel is, en wat de wensen zijn</w:t>
       </w:r>
     </w:p>
     <w:sectPr>

</xml_diff>